<commit_message>
One-pager numbers refreshed (68 guides, 942 Qs, 115 services, two-ward pilot, staff nurse); backlog: queue gdpr + dev-panel review
Co-Authored-By: Claude Fable 5 <noreply@anthropic.com>
</commit_message>
<xml_diff>
--- a/docs/nhs-ready/10a-one-pager.docx
+++ b/docs/nhs-ready/10a-one-pager.docx
@@ -48,7 +48,7 @@
           <w:sz w:val="21"/>
           <w:szCs w:val="21"/>
         </w:rPr>
-        <w:t xml:space="preserve">wardHub is a working web app built in his own time by a Ward NIC at Derbyshire Healthcare. It holds 64 step-by-step guides, 113 checked links, a 364-question training quiz and a map of 109 local services, and every guide wears its approval status on its face. It is live now at </w:t>
+        <w:t xml:space="preserve">wardHub is a working web app built in his own time by a staff nurse at Derbyshire Healthcare. It holds 68 step-by-step guides, 113 checked links, a 942-question training quiz and a map of 115 local services, and every guide wears its approval status on its face. It is live now at </w:t>
       </w:r>
       <w:r>
         <w:rPr>
@@ -242,7 +242,7 @@
           <w:sz w:val="21"/>
           <w:szCs w:val="21"/>
         </w:rPr>
-        <w:t xml:space="preserve">A pilot on one ward, using the demo as it stands.</w:t>
+        <w:t xml:space="preserve">A pilot on two wards, using the demo as it stands.</w:t>
       </w:r>
     </w:p>
     <w:p>
@@ -300,7 +300,7 @@
           <w:sz w:val="21"/>
           <w:szCs w:val="21"/>
         </w:rPr>
-        <w:t xml:space="preserve">Contact: Michael Sharpe, Ward NIC - michael.sharpe4@nhs.net</w:t>
+        <w:t xml:space="preserve">Contact: Michael Sharpe, Staff Nurse - michael.sharpe4@nhs.net</w:t>
       </w:r>
     </w:p>
     <w:sectPr>

</xml_diff>